<commit_message>
Keep LAUNCH packs and make all verified term-week coverage discoverable
</commit_message>
<xml_diff>
--- a/primary/year5/science/autumn/forces/Y5_Forces_SoW_and_Plans.docx
+++ b/primary/year5/science/autumn/forces/Y5_Forces_SoW_and_Plans.docx
@@ -920,7 +920,7 @@
           </w:tcPr>
           <w:p>
             <w:r>
-              <w:t xml:space="preserve">Know gravity is a non-contact force pulling objects to Earth’s centre; distinguish mass and weight; same-size objects fall at the same rate.</w:t>
+              <w:t xml:space="preserve">Know gravity is a non-contact force pulling objects to Earth’s centre; distinguish mass and weight; without air resistance, all masses accelerate equally.</w:t>
             </w:r>
           </w:p>
         </w:tc>
@@ -7049,7 +7049,7 @@
         <w:t xml:space="preserve">LO:  </w:t>
       </w:r>
       <w:r>
-        <w:t xml:space="preserve">Understand that gravity is a non-contact force pulling objects towards Earth’s centre; distinguish mass and weight; know same-size objects fall at the same rate.</w:t>
+        <w:t xml:space="preserve">Understand that gravity is a non-contact force pulling objects towards Earth’s centre; distinguish mass and weight; know without air resistance, all masses accelerate equally.</w:t>
       </w:r>
     </w:p>
     <w:p>
@@ -7128,7 +7128,7 @@
         <w:t xml:space="preserve">🌳 Oak  </w:t>
       </w:r>
       <w:r>
-        <w:t xml:space="preserve">Explains why same-sized objects of different mass land together.</w:t>
+        <w:t xml:space="preserve">Explains equal fall from the same height when air resistance is negligible.</w:t>
       </w:r>
     </w:p>
     <w:p>
@@ -7368,7 +7368,7 @@
           </w:tcPr>
           <w:p>
             <w:r>
-              <w:t xml:space="preserve">Which hits the ground first? Gravity as a non-contact force.</w:t>
+              <w:t xml:space="preserve">Predict a fall with and without air resistance; gravity is non-contact.</w:t>
             </w:r>
           </w:p>
         </w:tc>
@@ -7557,7 +7557,7 @@
           </w:tcPr>
           <w:p>
             <w:r>
-              <w:t xml:space="preserve">Same size, same fall (animation: two balls land together).</w:t>
+              <w:t xml:space="preserve">Gravity-only model: two balls released together, no air resistance.</w:t>
             </w:r>
           </w:p>
         </w:tc>
@@ -7777,7 +7777,7 @@
         <w:spacing w:after="60"/>
       </w:pPr>
       <w:r>
-        <w:t xml:space="preserve">“Heavier objects always fall faster” and “there is no gravity on the Moon” — same-size objects fall together; the Moon’s gravity is weaker, not absent.</w:t>
+        <w:t xml:space="preserve">“Heavier objects always fall faster” and “there is no gravity on the Moon” — without air resistance, objects accelerate equally; the Moon’s gravity is weaker, not absent.</w:t>
       </w:r>
     </w:p>
     <w:p>
@@ -7805,7 +7805,7 @@
         <w:spacing w:after="40"/>
       </w:pPr>
       <w:r>
-        <w:t xml:space="preserve">Video ‘What is gravity? — Year 5 Forces’; equal-fall animation; Gravity Sorter; TA Focus; Cold Call; print pack.</w:t>
+        <w:t xml:space="preserve">Video ‘What is gravity? — Year 5 Forces’; gravity-only animation (no air resistance); Gravity Sorter; TA Focus; Cold Call; print pack.</w:t>
       </w:r>
     </w:p>
     <w:p>

</xml_diff>

<commit_message>
Keep LAUNCH Science packs and expose full term/week coverage (#337)
* Keep LAUNCH packs and make all verified term-week coverage discoverable

* Pin the reviewed Education recovery publisher
</commit_message>
<xml_diff>
--- a/primary/year5/science/autumn/forces/Y5_Forces_SoW_and_Plans.docx
+++ b/primary/year5/science/autumn/forces/Y5_Forces_SoW_and_Plans.docx
@@ -920,7 +920,7 @@
           </w:tcPr>
           <w:p>
             <w:r>
-              <w:t xml:space="preserve">Know gravity is a non-contact force pulling objects to Earth’s centre; distinguish mass and weight; same-size objects fall at the same rate.</w:t>
+              <w:t xml:space="preserve">Know gravity is a non-contact force pulling objects to Earth’s centre; distinguish mass and weight; without air resistance, all masses accelerate equally.</w:t>
             </w:r>
           </w:p>
         </w:tc>
@@ -7049,7 +7049,7 @@
         <w:t xml:space="preserve">LO:  </w:t>
       </w:r>
       <w:r>
-        <w:t xml:space="preserve">Understand that gravity is a non-contact force pulling objects towards Earth’s centre; distinguish mass and weight; know same-size objects fall at the same rate.</w:t>
+        <w:t xml:space="preserve">Understand that gravity is a non-contact force pulling objects towards Earth’s centre; distinguish mass and weight; know without air resistance, all masses accelerate equally.</w:t>
       </w:r>
     </w:p>
     <w:p>
@@ -7128,7 +7128,7 @@
         <w:t xml:space="preserve">🌳 Oak  </w:t>
       </w:r>
       <w:r>
-        <w:t xml:space="preserve">Explains why same-sized objects of different mass land together.</w:t>
+        <w:t xml:space="preserve">Explains equal fall from the same height when air resistance is negligible.</w:t>
       </w:r>
     </w:p>
     <w:p>
@@ -7368,7 +7368,7 @@
           </w:tcPr>
           <w:p>
             <w:r>
-              <w:t xml:space="preserve">Which hits the ground first? Gravity as a non-contact force.</w:t>
+              <w:t xml:space="preserve">Predict a fall with and without air resistance; gravity is non-contact.</w:t>
             </w:r>
           </w:p>
         </w:tc>
@@ -7557,7 +7557,7 @@
           </w:tcPr>
           <w:p>
             <w:r>
-              <w:t xml:space="preserve">Same size, same fall (animation: two balls land together).</w:t>
+              <w:t xml:space="preserve">Gravity-only model: two balls released together, no air resistance.</w:t>
             </w:r>
           </w:p>
         </w:tc>
@@ -7777,7 +7777,7 @@
         <w:spacing w:after="60"/>
       </w:pPr>
       <w:r>
-        <w:t xml:space="preserve">“Heavier objects always fall faster” and “there is no gravity on the Moon” — same-size objects fall together; the Moon’s gravity is weaker, not absent.</w:t>
+        <w:t xml:space="preserve">“Heavier objects always fall faster” and “there is no gravity on the Moon” — without air resistance, objects accelerate equally; the Moon’s gravity is weaker, not absent.</w:t>
       </w:r>
     </w:p>
     <w:p>
@@ -7805,7 +7805,7 @@
         <w:spacing w:after="40"/>
       </w:pPr>
       <w:r>
-        <w:t xml:space="preserve">Video ‘What is gravity? — Year 5 Forces’; equal-fall animation; Gravity Sorter; TA Focus; Cold Call; print pack.</w:t>
+        <w:t xml:space="preserve">Video ‘What is gravity? — Year 5 Forces’; gravity-only animation (no air resistance); Gravity Sorter; TA Focus; Cold Call; print pack.</w:t>
       </w:r>
     </w:p>
     <w:p>

</xml_diff>